<commit_message>
Update Q3 audit report with Alejandra + rebuild PPT for compatibility
- Added Alejandra Velez Alicea, MD (from PDF export): 10 charts,
  avg 72.9%, Corrective Education Required, rank #11 of 13.
- Program total now: 13 providers, 130 charts, avg 76.4%.
- Distribution: 3 Needs Improvement, 10 Corrective Education Required.

Rebuilt PPT without the embedded chart (which was causing open failures
for the user). Replaced with a shape-based bar visualization that
renders in every PowerPoint version and preview app.

Word doc updated to match: cover, exec summary, ranked table, band
sections, recommendations, and Alejandra data-source note.

Co-Authored-By: Claude Opus 4.7 <noreply@anthropic.com>
Claude-Session: https://claude.ai/code/session_01FQCsD1ZdbqSqbtLgYtoLBe
</commit_message>
<xml_diff>
--- a/docs/Q3_2026_Provider_Audit_Report.docx
+++ b/docs/Q3_2026_Provider_Audit_Report.docx
@@ -22,7 +22,7 @@
           <w:color w:val="555555"/>
           <w:sz w:val="22"/>
         </w:rPr>
-        <w:t>HealthProMed  ·  Coding &amp; CDI Department  ·  Q3 2026 audit cycle  ·  12 providers</w:t>
+        <w:t>HealthProMed  ·  Coding &amp; CDI Department  ·  Q3 2026 audit cycle  ·  13 providers</w:t>
       </w:r>
     </w:p>
     <w:tbl>
@@ -56,7 +56,7 @@
           </w:tcPr>
           <w:p>
             <w:r>
-              <w:t>Encounters DOS 05/06/2026 – 07/28/2026</w:t>
+              <w:t>Encounters DOS 05/06/2026 – 09/06/2026</w:t>
             </w:r>
           </w:p>
         </w:tc>
@@ -108,7 +108,7 @@
           </w:tcPr>
           <w:p>
             <w:r>
-              <w:t>12 (Excel) + 1 pending PDF review (Alejandra Velez Alicea, MD)</w:t>
+              <w:t>13 (12 Excel workbooks + 1 from PDF: Alejandra Velez Alicea, MD)</w:t>
             </w:r>
           </w:p>
         </w:tc>
@@ -134,7 +134,7 @@
           </w:tcPr>
           <w:p>
             <w:r>
-              <w:t>120 audited claims</w:t>
+              <w:t>130 audited claims</w:t>
             </w:r>
           </w:p>
         </w:tc>
@@ -211,7 +211,7 @@
         <w:rPr>
           <w:sz w:val="22"/>
         </w:rPr>
-        <w:t>Twelve providers were audited across the July–September 2026 cycle (120 total charts). No provider scored in the Excellent (≥95%) or Meets Expectations (90–94%) bands. Three providers scored in the Needs Improvement band (80–89%). Nine providers scored below 80% and require formal Corrective Education plus a 60–90-day re-audit.</w:t>
+        <w:t>Thirteen providers were audited across the July–September 2026 cycle (130 total charts). No provider scored in the Excellent (≥95%) or Meets Expectations (90–94%) bands. Three providers scored in the Needs Improvement band (80–89%). Ten providers scored below 80% and require formal Corrective Education plus a 60–90-day re-audit.</w:t>
       </w:r>
     </w:p>
     <w:p>
@@ -461,7 +461,7 @@
               <w:rPr>
                 <w:sz w:val="21"/>
               </w:rPr>
-              <w:t>25%</w:t>
+              <w:t>23%</w:t>
             </w:r>
           </w:p>
         </w:tc>
@@ -505,7 +505,7 @@
               <w:rPr>
                 <w:sz w:val="21"/>
               </w:rPr>
-              <w:t>9</w:t>
+              <w:t>10</w:t>
             </w:r>
           </w:p>
         </w:tc>
@@ -519,7 +519,7 @@
               <w:rPr>
                 <w:sz w:val="21"/>
               </w:rPr>
-              <w:t>75%</w:t>
+              <w:t>77%</w:t>
             </w:r>
           </w:p>
         </w:tc>
@@ -560,7 +560,7 @@
               <w:rPr>
                 <w:sz w:val="21"/>
               </w:rPr>
-              <w:t>12</w:t>
+              <w:t>13</w:t>
             </w:r>
           </w:p>
         </w:tc>
@@ -589,7 +589,7 @@
           <w:color w:val="B45309"/>
           <w:sz w:val="26"/>
         </w:rPr>
-        <w:t>Program-wide average compliance: 76.7%</w:t>
+        <w:t>Program-wide average compliance: 76.4%</w:t>
       </w:r>
     </w:p>
     <w:p>
@@ -1445,6 +1445,78 @@
               <w:rPr>
                 <w:sz w:val="21"/>
               </w:rPr>
+              <w:t>Alejandra Velez Alicea, MD</w:t>
+            </w:r>
+          </w:p>
+        </w:tc>
+        <w:tc>
+          <w:tcPr>
+            <w:tcW w:type="dxa" w:w="2592"/>
+            <w:shd w:fill="F8C9C9"/>
+          </w:tcPr>
+          <w:p>
+            <w:r>
+              <w:rPr>
+                <w:sz w:val="21"/>
+              </w:rPr>
+              <w:t>MMM Vital</w:t>
+            </w:r>
+          </w:p>
+        </w:tc>
+        <w:tc>
+          <w:tcPr>
+            <w:tcW w:type="dxa" w:w="1872"/>
+            <w:shd w:fill="F8C9C9"/>
+          </w:tcPr>
+          <w:p>
+            <w:r>
+              <w:rPr>
+                <w:sz w:val="21"/>
+              </w:rPr>
+              <w:t>72.9%</w:t>
+            </w:r>
+          </w:p>
+        </w:tc>
+        <w:tc>
+          <w:tcPr>
+            <w:tcW w:type="dxa" w:w="3312"/>
+            <w:shd w:fill="F8C9C9"/>
+          </w:tcPr>
+          <w:p>
+            <w:r>
+              <w:rPr>
+                <w:sz w:val="21"/>
+              </w:rPr>
+              <w:t>Corrective Education Required</w:t>
+            </w:r>
+          </w:p>
+        </w:tc>
+      </w:tr>
+      <w:tr>
+        <w:tc>
+          <w:tcPr>
+            <w:tcW w:type="dxa" w:w="864"/>
+            <w:shd w:fill="F8C9C9"/>
+          </w:tcPr>
+          <w:p>
+            <w:r>
+              <w:rPr>
+                <w:sz w:val="21"/>
+              </w:rPr>
+              <w:t>12</w:t>
+            </w:r>
+          </w:p>
+        </w:tc>
+        <w:tc>
+          <w:tcPr>
+            <w:tcW w:type="dxa" w:w="3456"/>
+            <w:shd w:fill="F8C9C9"/>
+          </w:tcPr>
+          <w:p>
+            <w:r>
+              <w:rPr>
+                <w:sz w:val="21"/>
+              </w:rPr>
               <w:t>Yolis Guerrero del Rio, MD</w:t>
             </w:r>
           </w:p>
@@ -1503,7 +1575,7 @@
               <w:rPr>
                 <w:sz w:val="21"/>
               </w:rPr>
-              <w:t>12</w:t>
+              <w:t>13</w:t>
             </w:r>
           </w:p>
         </w:tc>
@@ -1849,7 +1921,7 @@
         <w:rPr>
           <w:sz w:val="22"/>
         </w:rPr>
-        <w:t>Nine providers scored below 80%. Each requires a formal Corrective Education plan, live 1-on-1 education session, and re-audit within 60–90 days of the education date. Missing the re-audit or failing to score above 80% on re-audit triggers escalation to the Compliance Committee.</w:t>
+        <w:t>Ten providers scored below 80%. Each requires a formal Corrective Education plan, live 1-on-1 education session, and re-audit within 60–90 days of the education date. Missing the re-audit or failing to score above 80% on re-audit triggers escalation to the Compliance Committee.</w:t>
       </w:r>
     </w:p>
     <w:tbl>
@@ -2331,7 +2403,7 @@
               <w:rPr>
                 <w:sz w:val="21"/>
               </w:rPr>
-              <w:t>Yolis Guerrero del Rio, MD</w:t>
+              <w:t>Alejandra Velez Alicea, MD</w:t>
             </w:r>
           </w:p>
         </w:tc>
@@ -2345,7 +2417,7 @@
               <w:rPr>
                 <w:sz w:val="21"/>
               </w:rPr>
-              <w:t>MCS Classicare</w:t>
+              <w:t>MMM Vital</w:t>
             </w:r>
           </w:p>
         </w:tc>
@@ -2359,7 +2431,7 @@
               <w:rPr>
                 <w:sz w:val="21"/>
               </w:rPr>
-              <w:t>72.0%</w:t>
+              <w:t>72.9%</w:t>
             </w:r>
           </w:p>
         </w:tc>
@@ -2388,6 +2460,61 @@
               <w:rPr>
                 <w:sz w:val="21"/>
               </w:rPr>
+              <w:t>Yolis Guerrero del Rio, MD</w:t>
+            </w:r>
+          </w:p>
+        </w:tc>
+        <w:tc>
+          <w:tcPr>
+            <w:tcW w:type="dxa" w:w="2304"/>
+          </w:tcPr>
+          <w:p>
+            <w:r>
+              <w:rPr>
+                <w:sz w:val="21"/>
+              </w:rPr>
+              <w:t>MCS Classicare</w:t>
+            </w:r>
+          </w:p>
+        </w:tc>
+        <w:tc>
+          <w:tcPr>
+            <w:tcW w:type="dxa" w:w="1296"/>
+          </w:tcPr>
+          <w:p>
+            <w:r>
+              <w:rPr>
+                <w:sz w:val="21"/>
+              </w:rPr>
+              <w:t>72.0%</w:t>
+            </w:r>
+          </w:p>
+        </w:tc>
+        <w:tc>
+          <w:tcPr>
+            <w:tcW w:type="dxa" w:w="3888"/>
+          </w:tcPr>
+          <w:p>
+            <w:r>
+              <w:rPr>
+                <w:sz w:val="21"/>
+              </w:rPr>
+              <w:t>Open corrective plan · schedule 1-on-1 education · re-audit in 60–90 days</w:t>
+            </w:r>
+          </w:p>
+        </w:tc>
+      </w:tr>
+      <w:tr>
+        <w:tc>
+          <w:tcPr>
+            <w:tcW w:type="dxa" w:w="3168"/>
+            <w:shd w:fill="F1F8F7"/>
+          </w:tcPr>
+          <w:p>
+            <w:r>
+              <w:rPr>
+                <w:sz w:val="21"/>
+              </w:rPr>
               <w:t>Ivette Perez Pagan, MD</w:t>
             </w:r>
           </w:p>
@@ -2395,6 +2522,7 @@
         <w:tc>
           <w:tcPr>
             <w:tcW w:type="dxa" w:w="2304"/>
+            <w:shd w:fill="F1F8F7"/>
           </w:tcPr>
           <w:p>
             <w:r>
@@ -2408,6 +2536,7 @@
         <w:tc>
           <w:tcPr>
             <w:tcW w:type="dxa" w:w="1296"/>
+            <w:shd w:fill="F1F8F7"/>
           </w:tcPr>
           <w:p>
             <w:r>
@@ -2421,6 +2550,7 @@
         <w:tc>
           <w:tcPr>
             <w:tcW w:type="dxa" w:w="3888"/>
+            <w:shd w:fill="F1F8F7"/>
           </w:tcPr>
           <w:p>
             <w:r>
@@ -2443,7 +2573,7 @@
           <w:color w:val="0F6E6E"/>
           <w:sz w:val="32"/>
         </w:rPr>
-        <w:t>4. Pending review — PDF format</w:t>
+        <w:t>4. Data source note — Alejandra Velez Alicea, MD</w:t>
       </w:r>
     </w:p>
     <w:tbl>
@@ -2493,7 +2623,7 @@
               <w:rPr>
                 <w:b/>
               </w:rPr>
-              <w:t>Format</w:t>
+              <w:t>Data source</w:t>
             </w:r>
           </w:p>
         </w:tc>
@@ -2503,7 +2633,7 @@
           </w:tcPr>
           <w:p>
             <w:r>
-              <w:t>PDF (not Excel workbook)</w:t>
+              <w:t>Audit data extracted from PDF export of the Provider Metrics tab</w:t>
             </w:r>
           </w:p>
         </w:tc>
@@ -2519,7 +2649,7 @@
               <w:rPr>
                 <w:b/>
               </w:rPr>
-              <w:t>Status</w:t>
+              <w:t>Compliance %</w:t>
             </w:r>
           </w:p>
         </w:tc>
@@ -2529,7 +2659,7 @@
           </w:tcPr>
           <w:p>
             <w:r>
-              <w:t>Excluded from automated ranking — requires manual entry into a workbook to be included in the rollup</w:t>
+              <w:t>72.9%  (Corrective Education Required)</w:t>
             </w:r>
           </w:p>
         </w:tc>
@@ -2545,7 +2675,7 @@
               <w:rPr>
                 <w:b/>
               </w:rPr>
-              <w:t>Action</w:t>
+              <w:t>Charts audited</w:t>
             </w:r>
           </w:p>
         </w:tc>
@@ -2555,7 +2685,59 @@
           </w:tcPr>
           <w:p>
             <w:r>
-              <w:t>Convert the PDF findings to the standard audit workbook so this provider's compliance % joins the ranked list</w:t>
+              <w:t>10</w:t>
+            </w:r>
+          </w:p>
+        </w:tc>
+      </w:tr>
+      <w:tr>
+        <w:tc>
+          <w:tcPr>
+            <w:tcW w:type="dxa" w:w="2880"/>
+            <w:shd w:fill="E6F4F1"/>
+          </w:tcPr>
+          <w:p>
+            <w:r>
+              <w:rPr>
+                <w:b/>
+              </w:rPr>
+              <w:t>Included in ranking</w:t>
+            </w:r>
+          </w:p>
+        </w:tc>
+        <w:tc>
+          <w:tcPr>
+            <w:tcW w:type="dxa" w:w="6480"/>
+          </w:tcPr>
+          <w:p>
+            <w:r>
+              <w:t>Yes — rank #11 of 13</w:t>
+            </w:r>
+          </w:p>
+        </w:tc>
+      </w:tr>
+      <w:tr>
+        <w:tc>
+          <w:tcPr>
+            <w:tcW w:type="dxa" w:w="2880"/>
+            <w:shd w:fill="E6F4F1"/>
+          </w:tcPr>
+          <w:p>
+            <w:r>
+              <w:rPr>
+                <w:b/>
+              </w:rPr>
+              <w:t>Recommendation</w:t>
+            </w:r>
+          </w:p>
+        </w:tc>
+        <w:tc>
+          <w:tcPr>
+            <w:tcW w:type="dxa" w:w="6480"/>
+          </w:tcPr>
+          <w:p>
+            <w:r>
+              <w:t>Migrate her audit into the standard Excel workbook format so future rollups auto-populate without PDF conversion</w:t>
             </w:r>
           </w:p>
         </w:tc>
@@ -2594,7 +2776,7 @@
         <w:ind w:left="360"/>
       </w:pPr>
       <w:r>
-        <w:t>Open a Corrective Education plan for all 9 providers in the &lt; 80% band and schedule 1-on-1 education sessions.</w:t>
+        <w:t>Open a Corrective Education plan for all 10 providers in the &lt; 80% band and schedule 1-on-1 education sessions.</w:t>
       </w:r>
     </w:p>
     <w:p>
@@ -2604,7 +2786,7 @@
         <w:ind w:left="360"/>
       </w:pPr>
       <w:r>
-        <w:t>Send monthly scorecard emails to all 12 providers including their band, top deficiencies, and next audit date.</w:t>
+        <w:t>Send monthly scorecard emails to all 13 providers including their band, top deficiencies, and next audit date.</w:t>
       </w:r>
     </w:p>
     <w:p>
@@ -2614,7 +2796,7 @@
         <w:ind w:left="360"/>
       </w:pPr>
       <w:r>
-        <w:t>Notify the Medical Director of the 9 corrective-plan providers so they're aware and can support the education.</w:t>
+        <w:t>Notify the Medical Director of the 10 corrective-plan providers so they're aware and can support the education.</w:t>
       </w:r>
     </w:p>
     <w:p>

</xml_diff>